<commit_message>
feat: review and edit business expenses
</commit_message>
<xml_diff>
--- a/docs/GLV_System_Documentation.docx
+++ b/docs/GLV_System_Documentation.docx
@@ -157,7 +157,7 @@
               <w:pStyle w:val="TableText"/>
             </w:pPr>
             <w:r>
-              <w:t xml:space="preserve">October 01, 2026</w:t>
+              <w:t xml:space="preserve">October 07, 2026</w:t>
             </w:r>
           </w:p>
         </w:tc>
@@ -9000,7 +9000,7 @@
         <w:pStyle w:val="Normal"/>
       </w:pPr>
       <w:r>
-        <w:t xml:space="preserve">The administrator-only /business workspace presents People, Payroll, Accounting and Analytics as four connected sections of one GLV workflow. It uses the existing Staff, Payment and StaffSalaryPayment records and adds leave requests, performance reviews and operating expenses. No module activation or duplicate employee setup is required.</w:t>
+        <w:t xml:space="preserve">The administrator-only /business workspace presents People, Payroll, Accounting and Analytics as four connected sections of one GLV workflow. It uses the existing Staff, Payment and StaffSalaryPayment records and adds leave requests, performance reviews and operating expenses. In Accounting, administrators can review the full expense history or filter by date range, and edit a cashbook entry to correct a mistake; each edit stores before and after values and the editor in the audit log. No module activation or duplicate employee setup is required.</w:t>
       </w:r>
     </w:p>
     <w:tbl>
@@ -9192,7 +9192,7 @@
               <w:pStyle w:val="TableText"/>
             </w:pPr>
             <w:r>
-              <w:t xml:space="preserve">Customer payments are cash inflow. Salary payments and BusinessExpense records are cash outflow. Staff deposits reconcile collections and are not counted twice.</w:t>
+              <w:t xml:space="preserve">Customer payments are cash inflow. Salary payments and BusinessExpense records are cash outflow. Staff deposits reconcile collections and are not counted twice. Administrators can review expenses across all dates or a selected date range and edit entries; edits are audit logged with before and after values.</w:t>
             </w:r>
           </w:p>
         </w:tc>

</xml_diff>

<commit_message>
Fix fully paid account rounding status
</commit_message>
<xml_diff>
--- a/docs/GLV_System_Documentation.docx
+++ b/docs/GLV_System_Documentation.docx
@@ -5950,6 +5950,48 @@
             </w:pPr>
             <w:r>
               <w:t xml:space="preserve">Inactivity is measured from the latest of start date, last payment date, and last reactivation date (CustomerAccount.reactivatedAt).</w:t>
+            </w:r>
+          </w:p>
+        </w:tc>
+      </w:tr>
+      <w:tr>
+        <w:tc>
+          <w:tcPr>
+            <w:tcW w:w="2400" w:type="dxa"/>
+            <w:vAlign w:val="top"/>
+            <w:tcMar>
+              <w:top w:w="80" w:type="dxa"/>
+              <w:left w:w="120" w:type="dxa"/>
+              <w:bottom w:w="80" w:type="dxa"/>
+              <w:right w:w="120" w:type="dxa"/>
+            </w:tcMar>
+          </w:tcPr>
+          <w:p>
+            <w:pPr>
+              <w:pStyle w:val="TableText"/>
+            </w:pPr>
+            <w:r>
+              <w:t xml:space="preserve">Paid-off precision</w:t>
+            </w:r>
+          </w:p>
+        </w:tc>
+        <w:tc>
+          <w:tcPr>
+            <w:tcW w:w="6960" w:type="dxa"/>
+            <w:vAlign w:val="top"/>
+            <w:tcMar>
+              <w:top w:w="80" w:type="dxa"/>
+              <w:left w:w="120" w:type="dxa"/>
+              <w:bottom w:w="80" w:type="dxa"/>
+              <w:right w:w="120" w:type="dxa"/>
+            </w:tcMar>
+          </w:tcPr>
+          <w:p>
+            <w:pPr>
+              <w:pStyle w:val="TableText"/>
+            </w:pPr>
+            <w:r>
+              <w:t xml:space="preserve">When a payment settles the remaining amount, the balance is set to exactly zero and the account becomes COMPLETED. Payment recording and lifecycle refresh treat floating-point residue up to 0.000000001 as zero; a backdated payment still uses its payment date for lifecycle timing.</w:t>
             </w:r>
           </w:p>
         </w:tc>

</xml_diff>

<commit_message>
Restore gauge cards on admin dashboard
</commit_message>
<xml_diff>
--- a/docs/GLV_System_Documentation.docx
+++ b/docs/GLV_System_Documentation.docx
@@ -157,7 +157,7 @@
               <w:pStyle w:val="TableText"/>
             </w:pPr>
             <w:r>
-              <w:t xml:space="preserve">October 12, 2026</w:t>
+              <w:t xml:space="preserve">October 14, 2026</w:t>
             </w:r>
           </w:p>
         </w:tc>
@@ -3040,7 +3040,7 @@
               <w:pStyle w:val="TableText"/>
             </w:pPr>
             <w:r>
-              <w:t xml:space="preserve">Role-shaped summary: admins see compact KPI cards followed by a weekly collections-versus-deposits curved trend and keyed account-status donut; staff see scoped KPIs with their own deposit total and trend indicators. Deposit data comes from StaffDeposit by depositDate and does not represent additional customer revenue. Admin period comparisons live in the trend chart.</w:t>
+              <w:t xml:space="preserve">Role-shaped summary: admins see animated semicircular KPI gauges where prior-period comparisons are available, followed by a weekly collections-versus-deposits curved trend and keyed account-status donut; staff see scoped KPIs with their own deposit total and trend indicators. Deposit data comes from StaffDeposit by depositDate and does not represent additional customer revenue. Longer-period comparisons live in the trend chart.</w:t>
             </w:r>
           </w:p>
         </w:tc>

</xml_diff>

<commit_message>
Add procurement filter to Accounts
</commit_message>
<xml_diff>
--- a/docs/GLV_System_Documentation.docx
+++ b/docs/GLV_System_Documentation.docx
@@ -157,7 +157,7 @@
               <w:pStyle w:val="TableText"/>
             </w:pPr>
             <w:r>
-              <w:t xml:space="preserve">October 14, 2026</w:t>
+              <w:t xml:space="preserve">October 16, 2026</w:t>
             </w:r>
           </w:p>
         </w:tc>
@@ -3226,7 +3226,7 @@
               <w:pStyle w:val="TableText"/>
             </w:pPr>
             <w:r>
-              <w:t xml:space="preserve">Product account creation, automatic terms, status, balance, delivery, corrections, lifecycle-gated cancellation/reactivation documents, and payment entry.</w:t>
+              <w:t xml:space="preserve">Product account creation, automatic terms, status, balance, delivery, corrections, lifecycle-gated cancellation/reactivation documents, payment entry, and a To buy (procurement list) filter using the configured payment threshold and stock allocation.</w:t>
             </w:r>
           </w:p>
         </w:tc>
@@ -4786,6 +4786,14 @@
       </w:pPr>
       <w:r>
         <w:t xml:space="preserve">A product therefore appears on the buying list only when the units its customers are owed exceed the units on the shelf; a product whose stock covers its demand does not appear at all. Stock is allocated to the customers closest to finishing their plan first, so the unit on the shelf is reserved for whoever is due it soonest. The allocation rule is the pure function allocateStockToDemand in lib/procurement.ts, covered by scripts/inventory.test.ts.</w:t>
+      </w:r>
+    </w:p>
+    <w:p>
+      <w:pPr>
+        <w:pStyle w:val="Normal"/>
+      </w:pPr>
+      <w:r>
+        <w:t xml:space="preserve">The Accounts page includes a To buy (procurement list) status filter. It selects pending-delivery accounts at or above the same configured payment threshold whose individual units are not covered by stock, matching the account allocations behind the products procurement list. The threshold defaults to 70 percent.</w:t>
       </w:r>
     </w:p>
     <w:p>

</xml_diff>

<commit_message>
Include fully paid accounts in threshold filter
</commit_message>
<xml_diff>
--- a/docs/GLV_System_Documentation.docx
+++ b/docs/GLV_System_Documentation.docx
@@ -3226,7 +3226,7 @@
               <w:pStyle w:val="TableText"/>
             </w:pPr>
             <w:r>
-              <w:t xml:space="preserve">Product account creation, automatic terms, status, balance, delivery, corrections, lifecycle-gated cancellation/reactivation documents, payment entry, and a To buy (procurement list) filter using the configured payment threshold and stock allocation.</w:t>
+              <w:t xml:space="preserve">Product account creation, automatic terms, status, balance, delivery, corrections, lifecycle-gated cancellation/reactivation documents, payment entry, and a payment-threshold filter for all eligible pending-delivery accounts, including fully paid accounts.</w:t>
             </w:r>
           </w:p>
         </w:tc>
@@ -4793,7 +4793,7 @@
         <w:pStyle w:val="Normal"/>
       </w:pPr>
       <w:r>
-        <w:t xml:space="preserve">The Accounts page includes a To buy (procurement list) status filter. It selects pending-delivery accounts at or above the same configured payment threshold whose individual units are not covered by stock, matching the account allocations behind the products procurement list. The threshold defaults to 70 percent.</w:t>
+        <w:t xml:space="preserve">The Accounts page includes a Payment threshold met (up to 100%) status filter. It selects every pending-delivery account at or above the configured procurement payment threshold, including fully paid accounts. The threshold defaults to 70 percent. Stock allocation does not affect the Accounts filter; stock only determines which products and quantities appear on the Products procurement list.</w:t>
       </w:r>
     </w:p>
     <w:p>

</xml_diff>

<commit_message>
Align account progress with payment thresholds
</commit_message>
<xml_diff>
--- a/docs/GLV_System_Documentation.docx
+++ b/docs/GLV_System_Documentation.docx
@@ -3226,7 +3226,7 @@
               <w:pStyle w:val="TableText"/>
             </w:pPr>
             <w:r>
-              <w:t xml:space="preserve">Product account creation, automatic terms, status, balance, delivery, corrections, lifecycle-gated cancellation/reactivation documents, payment entry, and a payment-threshold filter for all eligible pending-delivery accounts, including fully paid accounts.</w:t>
+              <w:t xml:space="preserve">Product account creation, automatic terms, status, balance, delivery, corrections, lifecycle-gated cancellation/reactivation documents, payment entry, a payment-threshold filter for all eligible pending-delivery accounts, and an amount-paid percentage with installment days shown separately.</w:t>
             </w:r>
           </w:p>
         </w:tc>
@@ -4793,7 +4793,7 @@
         <w:pStyle w:val="Normal"/>
       </w:pPr>
       <w:r>
-        <w:t xml:space="preserve">The Accounts page includes a Payment threshold met (up to 100%) status filter. It selects every pending-delivery account at or above the configured procurement payment threshold, including fully paid accounts. The threshold defaults to 70 percent. Stock allocation does not affect the Accounts filter; stock only determines which products and quantities appear on the Products procurement list.</w:t>
+        <w:t xml:space="preserve">The Accounts page includes a Payment threshold met (up to 100%) status filter. It selects every pending-delivery account at or above the configured procurement payment threshold, including fully paid accounts. The threshold defaults to 70 percent. Paid Progress now shows amount collected divided by the account target, matching the filter and procurement threshold. The days-covered count is displayed separately, since it measures daily-payment schedule coverage and may differ when a customer pays ahead of or behind that schedule. Stock allocation does not affect the Accounts filter; stock only determines which products and quantities appear on the Products procurement list.</w:t>
       </w:r>
     </w:p>
     <w:p>

</xml_diff>

<commit_message>
Enforce procurement payment threshold in cents
</commit_message>
<xml_diff>
--- a/docs/GLV_System_Documentation.docx
+++ b/docs/GLV_System_Documentation.docx
@@ -3226,7 +3226,7 @@
               <w:pStyle w:val="TableText"/>
             </w:pPr>
             <w:r>
-              <w:t xml:space="preserve">Product account creation, automatic terms, status, balance, delivery, corrections, lifecycle-gated cancellation/reactivation documents, payment entry, a payment-threshold filter for all eligible pending-delivery accounts, and an amount-paid percentage with installment days shown separately.</w:t>
+              <w:t xml:space="preserve">Product account creation, automatic terms, status, balance, delivery, corrections, lifecycle-gated cancellation/reactivation documents, payment entry, a payment-threshold filter for all eligible pending-delivery accounts, and installment-day progress.</w:t>
             </w:r>
           </w:p>
         </w:tc>
@@ -4793,7 +4793,7 @@
         <w:pStyle w:val="Normal"/>
       </w:pPr>
       <w:r>
-        <w:t xml:space="preserve">The Accounts page includes a Payment threshold met (up to 100%) status filter. It selects every pending-delivery account at or above the configured procurement payment threshold, including fully paid accounts. The threshold defaults to 70 percent. Paid Progress now shows amount collected divided by the account target, matching the filter and procurement threshold. The days-covered count is displayed separately, since it measures daily-payment schedule coverage and may differ when a customer pays ahead of or behind that schedule. Stock allocation does not affect the Accounts filter; stock only determines which products and quantities appear on the Products procurement list.</w:t>
+        <w:t xml:space="preserve">The Accounts page includes a Payment threshold met (up to 100%) status filter. It selects every pending-delivery account at or above the configured procurement payment threshold, including fully paid accounts. The threshold defaults to 70 percent. Paid Progress displays installment days covered out of the plan duration. This day-based display is separate from the amount threshold used to qualify accounts for the filter. The threshold compares paid amount with the account target in currency cents. Stock allocation does not affect the Accounts filter; stock only determines which products and quantities appear on the Products procurement list.</w:t>
       </w:r>
     </w:p>
     <w:p>

</xml_diff>

<commit_message>
Split weekly activity collections by staff
</commit_message>
<xml_diff>
--- a/docs/GLV_System_Documentation.docx
+++ b/docs/GLV_System_Documentation.docx
@@ -157,7 +157,7 @@
               <w:pStyle w:val="TableText"/>
             </w:pPr>
             <w:r>
-              <w:t xml:space="preserve">October 16, 2026</w:t>
+              <w:t xml:space="preserve">October 20, 2026</w:t>
             </w:r>
           </w:p>
         </w:tc>
@@ -3471,7 +3471,7 @@
               <w:pStyle w:val="TableText"/>
             </w:pPr>
             <w:r>
-              <w:t xml:space="preserve">Operational activity charts use curved daily payment trends, keyed account-status donuts, and ranked dot plots; staff views remain scoped and hide business financial values.</w:t>
+              <w:t xml:space="preserve">Operational activity charts show administrator weekly collections as separate curved daily lines for each collecting staff member, with a keyed legend, plus account-status donuts and ranked dot plots. Staff views remain scoped and hide business financial values.</w:t>
             </w:r>
           </w:p>
         </w:tc>

</xml_diff>

<commit_message>
Improve lifecycle scheduling and wire business rules
</commit_message>
<xml_diff>
--- a/docs/GLV_System_Documentation.docx
+++ b/docs/GLV_System_Documentation.docx
@@ -157,7 +157,7 @@
               <w:pStyle w:val="TableText"/>
             </w:pPr>
             <w:r>
-              <w:t xml:space="preserve">October 20, 2026</w:t>
+              <w:t xml:space="preserve">October 22, 2026</w:t>
             </w:r>
           </w:p>
         </w:tc>
@@ -4725,7 +4725,7 @@
               <w:pStyle w:val="CodeBlock"/>
             </w:pPr>
             <w:r>
-              <w:t xml:space="preserve">Archive (lifecycle sweep, 2 days after delivery)</w:t>
+              <w:t xml:space="preserve">Archive (daily 09:00 lifecycle job plus hourly post-response freshness guard; configured delay after delivery; 2 days when setting is zero)</w:t>
             </w:r>
           </w:p>
           <w:p>
@@ -5363,7 +5363,7 @@
               <w:pStyle w:val="TableText"/>
             </w:pPr>
             <w:r>
-              <w:t xml:space="preserve">The lifecycle sweep archives COMPLETED, DELIVERED, zero-balance plans two days after delivery (or at once when the delivery has no date), and returns any ARCHIVED plan that is undelivered (to COMPLETED) or owes money (to ACTIVE), audit logged as RESTORE_ARCHIVED_ACCOUNT. Every sweep write is conditional on the status it read, so overlapping sweeps cannot double-archive, double-close or mint two closure refund credits.</w:t>
+              <w:t xml:space="preserve">A daily 09:00 CRON_SECRET-protected job runs the lifecycle sweep; page and report requests register a post-response freshness guard that keeps active systems fresh at most hourly. A database lease coordinates instances. The setting deliveryTimeAfterCompletionDays controls the delay; zero keeps the two-day default. A completed, delivered, zero-balance account with no delivery date is archived immediately. Misfiled archived accounts return to the correct work list. Writes are conditional on the status read, so overlapping work cannot duplicate a closure credit.</w:t>
             </w:r>
           </w:p>
         </w:tc>
@@ -7091,7 +7091,7 @@
               <w:pStyle w:val="TableText"/>
             </w:pPr>
             <w:r>
-              <w:t xml:space="preserve">When closing with paid amount and no prior closure credit, 32% service fee is deducted and remaining amount becomes an open credit.</w:t>
+              <w:t xml:space="preserve">When closing with paid amount and no prior closure credit, the configured refund deduction is applied (32% when the saved setting is zero) and the remainder becomes an open credit.</w:t>
             </w:r>
           </w:p>
         </w:tc>
@@ -7133,7 +7133,7 @@
               <w:pStyle w:val="TableText"/>
             </w:pPr>
             <w:r>
-              <w:t xml:space="preserve">An admin may reactivate a DORMANT, PROBATION or CLOSED account once 6 months of inactivity have passed. A 32% service fee is deducted from the paid amount, open closure-refund credits are voided, and reactivatedAt is stamped so the ladder restarts from that date instead of re-closing the account on the next sweep.</w:t>
+              <w:t xml:space="preserve">An admin may reactivate a DORMANT, PROBATION or CLOSED account once 6 months of inactivity have passed. The configured refund deduction (32% when zero) is charged against the paid amount, open closure-refund credits are voided, and reactivatedAt is stamped so the ladder restarts from that date.</w:t>
             </w:r>
           </w:p>
         </w:tc>
@@ -7295,7 +7295,7 @@
         <w:pStyle w:val="Normal"/>
       </w:pPr>
       <w:r>
-        <w:t xml:space="preserve">Reports combine customer/account/payment/staff/salary data into admin-facing summaries and an Excel workbook. The weekly export refreshes lifecycle statuses first, then builds sheets for executive summary, staff performance, accounts, weekly payment history, product profitability, procurement list, and weekly ledger.</w:t>
+        <w:t xml:space="preserve">Reports combine customer/account/payment/staff/salary data into admin-facing summaries and an Excel workbook. A daily 09:00 CRON_SECRET-protected lifecycle job refreshes statuses, with post-response freshness guards during active use; the weekly export registers its guard before building sheets for executive summary, staff performance, accounts, weekly payment history, product profitability, procurement list, and weekly ledger.</w:t>
       </w:r>
     </w:p>
     <w:tbl>
@@ -7407,7 +7407,7 @@
               <w:pStyle w:val="CodeBlock"/>
             </w:pPr>
             <w:r>
-              <w:t xml:space="preserve">  +--&gt; refreshAccountLifecycleStatuses()</w:t>
+              <w:t xml:space="preserve">  +--&gt; register post-response lifecycle freshness guard</w:t>
             </w:r>
           </w:p>
           <w:p>
@@ -8369,7 +8369,7 @@
         <w:pStyle w:val="Normal"/>
       </w:pPr>
       <w:r>
-        <w:t xml:space="preserve">Settings is the broad admin control panel. It persists company profile, layaway defaults, fees, procurement threshold, payroll defaults, receipt/customer/staff code prefixes, security toggles, notification preferences, theme settings, and system status labels. Some settings are actively consumed; others are stored for future or partial wiring, so operators should distinguish saved configuration from behavior that is actually enforced downstream.</w:t>
+        <w:t xml:space="preserve">Settings is the broad admin control panel. It persists company profile, layaway defaults, fees, procurement threshold, payroll defaults, receipt/customer/staff code prefixes, security toggles, notification preferences, theme settings, and system status labels. Effective rules are listed below; administration fee and commission percentages remain saved-only until their calculation bases are defined.</w:t>
       </w:r>
     </w:p>
     <w:tbl>
@@ -8564,7 +8564,7 @@
               <w:pStyle w:val="TableText"/>
             </w:pPr>
             <w:r>
-              <w:t xml:space="preserve">installmentDurationDays, defaultDailyCollection, minimumDeposit</w:t>
+              <w:t xml:space="preserve">installmentDurationDays, defaultDailyCollection, minimumDeposit, deliveryTimeAfterCompletionDays</w:t>
             </w:r>
           </w:p>
         </w:tc>
@@ -8584,7 +8584,7 @@
               <w:pStyle w:val="TableText"/>
             </w:pPr>
             <w:r>
-              <w:t xml:space="preserve">Used as product/account creation defaults where wired.</w:t>
+              <w:t xml:space="preserve">Minimum deposit is enforced on a plan's first payment; delivery setting controls the archive delay (two-day fallback when zero).</w:t>
             </w:r>
           </w:p>
         </w:tc>
@@ -8606,6 +8606,68 @@
               <w:pStyle w:val="TableText"/>
             </w:pPr>
             <w:r>
+              <w:t xml:space="preserve">Refunds</w:t>
+            </w:r>
+          </w:p>
+        </w:tc>
+        <w:tc>
+          <w:tcPr>
+            <w:tcW w:w="3000" w:type="dxa"/>
+            <w:vAlign w:val="top"/>
+            <w:tcMar>
+              <w:top w:w="80" w:type="dxa"/>
+              <w:left w:w="120" w:type="dxa"/>
+              <w:bottom w:w="80" w:type="dxa"/>
+              <w:right w:w="120" w:type="dxa"/>
+            </w:tcMar>
+          </w:tcPr>
+          <w:p>
+            <w:pPr>
+              <w:pStyle w:val="TableText"/>
+            </w:pPr>
+            <w:r>
+              <w:t xml:space="preserve">refundDeductionPercent</w:t>
+            </w:r>
+          </w:p>
+        </w:tc>
+        <w:tc>
+          <w:tcPr>
+            <w:tcW w:w="4460" w:type="dxa"/>
+            <w:vAlign w:val="top"/>
+            <w:tcMar>
+              <w:top w:w="80" w:type="dxa"/>
+              <w:left w:w="120" w:type="dxa"/>
+              <w:bottom w:w="80" w:type="dxa"/>
+              <w:right w:w="120" w:type="dxa"/>
+            </w:tcMar>
+          </w:tcPr>
+          <w:p>
+            <w:pPr>
+              <w:pStyle w:val="TableText"/>
+            </w:pPr>
+            <w:r>
+              <w:t xml:space="preserve">Applied to closure refunds and dormant-account reactivation charges; zero retains the 32% fallback.</w:t>
+            </w:r>
+          </w:p>
+        </w:tc>
+      </w:tr>
+      <w:tr>
+        <w:tc>
+          <w:tcPr>
+            <w:tcW w:w="1900" w:type="dxa"/>
+            <w:vAlign w:val="top"/>
+            <w:tcMar>
+              <w:top w:w="80" w:type="dxa"/>
+              <w:left w:w="120" w:type="dxa"/>
+              <w:bottom w:w="80" w:type="dxa"/>
+              <w:right w:w="120" w:type="dxa"/>
+            </w:tcMar>
+          </w:tcPr>
+          <w:p>
+            <w:pPr>
+              <w:pStyle w:val="TableText"/>
+            </w:pPr>
+            <w:r>
               <w:t xml:space="preserve">Procurement</w:t>
             </w:r>
           </w:p>
@@ -8708,7 +8770,7 @@
               <w:pStyle w:val="TableText"/>
             </w:pPr>
             <w:r>
-              <w:t xml:space="preserve">Salary defaults and reporting support.</w:t>
+              <w:t xml:space="preserve">Salary defaults and reporting support. Commission settings are saved-only until the calculation base and payroll treatment are defined.</w:t>
             </w:r>
           </w:p>
         </w:tc>
@@ -8832,7 +8894,7 @@
               <w:pStyle w:val="TableText"/>
             </w:pPr>
             <w:r>
-              <w:t xml:space="preserve">Some fields are stored; password-change enforcement is live through Auth.js/session logic.</w:t>
+              <w:t xml:space="preserve">Session timeout is checked against the current saved setting on authenticated requests; password-change and 2FA enforcement remain active.</w:t>
             </w:r>
           </w:p>
         </w:tc>

</xml_diff>

<commit_message>
Keep dashboard KPI cards compact at desktop zoom
</commit_message>
<xml_diff>
--- a/docs/GLV_System_Documentation.docx
+++ b/docs/GLV_System_Documentation.docx
@@ -157,7 +157,7 @@
               <w:pStyle w:val="TableText"/>
             </w:pPr>
             <w:r>
-              <w:t xml:space="preserve">October 22, 2026</w:t>
+              <w:t xml:space="preserve">October 26, 2026</w:t>
             </w:r>
           </w:p>
         </w:tc>
@@ -3409,7 +3409,7 @@
               <w:pStyle w:val="TableText"/>
             </w:pPr>
             <w:r>
-              <w:t xml:space="preserve">Role-shaped summary: admins see animated semicircular KPI gauges where prior-period comparisons are available, followed by a weekly collections-versus-deposits curved trend and keyed account-status donut; staff see scoped KPIs with their own deposit total and trend indicators. Deposit data comes from StaffDeposit by depositDate and does not represent additional customer revenue. Longer-period comparisons live in the trend chart.</w:t>
+              <w:t xml:space="preserve">Role-shaped summary: admins see animated semicircular KPI gauges where prior-period comparisons are available in a four-column desktop card layout from the large breakpoint, followed by a weekly collections-versus-deposits curved trend and keyed account-status donut; staff see scoped KPIs with their own deposit total and trend indicators. Deposit data comes from StaffDeposit by depositDate and does not represent additional customer revenue. Longer-period comparisons live in the trend chart.</w:t>
             </w:r>
           </w:p>
         </w:tc>

</xml_diff>

<commit_message>
Add weekly staff performance SMS
</commit_message>
<xml_diff>
--- a/docs/GLV_System_Documentation.docx
+++ b/docs/GLV_System_Documentation.docx
@@ -157,7 +157,7 @@
               <w:pStyle w:val="TableText"/>
             </w:pPr>
             <w:r>
-              <w:t xml:space="preserve">October 26, 2026</w:t>
+              <w:t xml:space="preserve">October 28, 2026</w:t>
             </w:r>
           </w:p>
         </w:tc>
@@ -10375,7 +10375,7 @@
         <w:pStyle w:val="Normal"/>
       </w:pPr>
       <w:r>
-        <w:t xml:space="preserve">Super administrators configure six database-backed message templates on Settings &gt; SMS: Salary payment, Customer welcome, 70% progress, Missed payment, Weekly summary - target met, and Weekly summary - below target. The page lists the placeholders permitted for each event, renders a sample preview, validates a 612-character maximum, and can restore all defaults. Saved templates apply to newly queued messages; existing queue rows keep their original message snapshot. Salary resolves to the staff member on the salary payment. Customer templates resolve to the qualifying customer. A customer or staff member with no usable phone number is skipped entirely: no message is queued, none is attempted, and nothing is sent to a fallback recipient.</w:t>
+        <w:t xml:space="preserve">Super administrators configure seven database-backed message templates on Settings &gt; SMS: Salary payment, Customer welcome, 70% progress, Missed payment, Weekly summary - target met, Weekly summary - below target, and Weekly staff performance. The page lists the placeholders permitted for each event, renders a sample preview, validates a 612-character maximum, and can restore all defaults. Saved templates apply to newly queued messages; existing queue rows keep their original message snapshot. Salary resolves to the staff member on the salary payment. Customer templates resolve to the qualifying customer; the weekly performance template resolves to the staff member whose deposit and rank it reports. A customer or staff member with no usable phone number is skipped entirely: no message is queued, none is attempted, and nothing is sent to a fallback recipient.</w:t>
       </w:r>
     </w:p>
     <w:p>
@@ -10415,6 +10415,14 @@
         <w:pStyle w:val="Normal"/>
       </w:pPr>
       <w:r>
+        <w:t xml:space="preserve">Each Monday, after prior-week staff deposits are recorded, GLV queues one performance SMS for every active staff member with a recorded deposit for the previous Monday-to-Sunday week. It reports the member's total customer collections and rank by the percentage of their weekly target achieved; the highest percentage ranks first and ties share a rank. Staff members with no previous-week target receive N/A for achievement and rank. The new-week target is the sum of daily amounts for assigned ACTIVE plans with a positive balance that are active at Monday's start, multiplied by seven. It is a full-week target and can differ from the week-prorated expected collection shown in Staff Performance when an account begins or ends midweek. The protected /api/cron/sms-notifications job checks Monday deposits, and recording a deposit on Monday also queues the message. The unique staff-and-week key prevents duplicates. Missing or unusable staff phone numbers are skipped.</w:t>
+      </w:r>
+    </w:p>
+    <w:p>
+      <w:pPr>
+        <w:pStyle w:val="Normal"/>
+      </w:pPr>
+      <w:r>
         <w:t xml:space="preserve">Active and overdue accounts with a positive balance qualify for reminders after fourteen full days (two weeks) without payment, and at most once per further two-week period thereafter, so the sequence is day 14, day 28, day 42. The later of account start, latest payment date and latest payment entry time anchors the interval. Backdated entries restart it. Other lifecycle statuses are excluded. The Missed payment template supports staffName, resolved to the first name of the staff member assigned to that customer. The protected /api/cron/sms-notifications job runs at 09:00 UTC daily, queues reminders and dispatches up to 100 messages in groups of five. Authenticated activity and qualifying mutations also dispatch pending messages. Monitor backlog and schedule more frequent runs if volume requires it.</w:t>
       </w:r>
     </w:p>
@@ -10423,7 +10431,7 @@
         <w:pStyle w:val="Normal"/>
       </w:pPr>
       <w:r>
-        <w:t xml:space="preserve">The dedicated /settings/sms page lets super administrators enable or pause automatic SMS, verify provider/API/sender configuration, review the five notification rules, inspect the latest 100 queue records, and retry definitive failures. The queue records unique event keys within the business transaction. Conditional claims prevent concurrent workers sending the same item. Before dispatch, source existence, account eligibility and current phone are checked. Correct missing phones or provider errors before Retry. Provider acceptance is labelled ACCEPTED, not confirmed handset delivery. Check BMS campaign history using the saved campaign ID. Rate limits retry after one hour, up to five attempts. Timeouts and interrupted workers become UNKNOWN and require reconciliation rather than blind resending. Restored pending or processing messages become UNKNOWN. Disabling SMS pauses the queue.</w:t>
+        <w:t xml:space="preserve">The dedicated /settings/sms page lets super administrators enable or pause automatic SMS, verify provider/API/sender configuration, review the seven notification rules, inspect the latest 100 queue records, and retry definitive failures. The queue records unique event keys within the business transaction. Conditional claims prevent concurrent workers sending the same item. Before dispatch, source existence, account eligibility and current phone are checked. Correct missing phones or provider errors before Retry. Provider acceptance is labelled ACCEPTED, not confirmed handset delivery. Check BMS campaign history using the saved campaign ID. Rate limits retry after one hour, up to five attempts. Timeouts and interrupted workers become UNKNOWN and require reconciliation rather than blind resending. Restored pending or processing messages become UNKNOWN. Disabling SMS pauses the queue.</w:t>
       </w:r>
     </w:p>
     <w:p>

</xml_diff>